<commit_message>
docs: alinea el guion del video 1 del modulo 1 con el mazo
</commit_message>
<xml_diff>
--- a/docs/capacitacion/guion youtube/modulo-1-el-problema-y-las-bases/video-1-el-problema-y-la-imagen-digital/modulo-1-video-1-el-problema-y-la-imagen-digital-natural.docx
+++ b/docs/capacitacion/guion youtube/modulo-1-el-problema-y-las-bases/video-1-el-problema-y-la-imagen-digital/modulo-1-video-1-el-problema-y-la-imagen-digital-natural.docx
@@ -100,7 +100,7 @@
           <w:i/>
           <w:sz w:val="20"/>
         </w:rPr>
-        <w:t>Idea central: Son cuatro módulos: el primero el problema y las bases teóricas, el segundo cómo aprende una computadora, el tercero el sitio funcionando y el cuarto datos, entrenamiento y despliegue.</w:t>
+        <w:t>Idea central: Son cuatro módulos: el primero el problema y las bases teóricas, el segundo teoría con más detalle, el tercero el sistema y su código, y el cuarto el entrenamiento en código y el despliegue.</w:t>
       </w:r>
     </w:p>
     <w:p>
@@ -115,17 +115,17 @@
     </w:p>
     <w:p>
       <w:r>
-        <w:t>En el segundo módulo, y lo resumo en una palabra, vemos cómo aprende una computadora, que es la esencia de una red neuronal artificial.</w:t>
+        <w:t>En el segundo módulo entramos con más detalle a la teoría: cómo ve una imagen una red convolucional, cómo funciona la red que usa el sitio, que se llama Mask R-CNN, cómo se aprovecha una red que ya fue entrenada para otra cosa, y cómo se preparan los datos y se entrena.</w:t>
       </w:r>
     </w:p>
     <w:p>
       <w:r>
-        <w:t>En el tercer módulo les enseño cómo funciona esta plataforma web. Una vez que entendimos el problema y exploramos las bases teóricas, ahora sí toca mostrar el sistema.</w:t>
+        <w:t>En el tercer módulo les enseño cómo funciona esta plataforma web, por fuera y por dentro, con su código. Una vez que entendimos el problema y exploramos las bases teóricas, ahora sí toca mostrar el sistema.</w:t>
       </w:r>
     </w:p>
     <w:p>
       <w:r>
-        <w:t>Y en el cuarto módulo veremos un par de ejemplos con datos, cómo se entrena la red neuronal y cómo es el despliegue de la información.</w:t>
+        <w:t>Y en el cuarto módulo vemos el código con el que se entrena la red, en un cuaderno de Colab, y cómo se despliega el sitio en la nube para que cualquiera pueda visitarlo.</w:t>
       </w:r>
     </w:p>
     <w:p>
@@ -192,7 +192,7 @@
     </w:p>
     <w:p>
       <w:r>
-        <w:t>Empiezo con una pregunta: ¿para qué sirve la inteligencia artificial en la educación y en la investigación? Hay muchas respuestas. Una, la que nos interesa hoy, es analizar imágenes. Una persona mira una imagen y reconoce lo que hay en ella. Un programa que aprendió de muchos ejemplos puede hacer algo parecido... y puede hacerlo una y otra vez, sin cansarse.</w:t>
+        <w:t>Empiezo con una pregunta: ¿para qué sirve la inteligencia artificial en la educación y en la investigación? Hay muchas respuestas. Una, la que nos interesa hoy, es analizar imágenes. Una persona mira una imagen y reconoce lo que hay en ella. Un programa que aprendió de muchos ejemplos puede hacer algo parecido... y puede hacerlo una y otra vez, sin cansarse. En lugar de escribirle reglas, se le muestran ejemplos de lo que debe encontrar.</w:t>
       </w:r>
     </w:p>
     <w:p>
@@ -274,7 +274,7 @@
     </w:p>
     <w:p>
       <w:r>
-        <w:t>Les muestro cómo se ve el problema. Esta es una imagen de fluorescencia: manchas brillantes de colores sobre un fondo oscuro. Cada mancha es la cabeza de un espermatozoide, y a veces se alcanza a ver una línea que sale de ella, la cola. ¿Cuántos hay en esta imagen? Lo primero que haría cualquiera es contarlos con la vista, uno por uno. Y si además hay que medir cada uno, ya no basta con mirar.</w:t>
+        <w:t>Les muestro cómo se ve el problema. Esta es una ilustración de una imagen de fluorescencia: manchas brillantes de colores sobre un fondo oscuro. Cada mancha es la cabeza de un espermatozoide, y a veces se alcanza a ver una línea que sale de ella, la cola. ¿Cuántos hay en esta imagen? Lo primero que haría cualquiera es contarlos con la vista, uno por uno. Y si además hay que medir cada uno, ya no basta con mirar.</w:t>
       </w:r>
     </w:p>
     <w:p>
@@ -325,7 +325,7 @@
     </w:p>
     <w:p>
       <w:r>
-        <w:t>Conteo, tamaño y distribución: eso es lo que el sistema entrega por cada imagen. Y todo depende de algo previo, saber dónde está cada cabeza.</w:t>
+        <w:t>Conteo, tamaño y distribución: eso es lo que el sistema entrega por cada imagen. Todo se puede descargar: un archivo CSV para trabajar en una hoja de cálculo y un informe en PDF para compartir. Y todo depende de algo previo, saber dónde está cada cabeza.</w:t>
       </w:r>
     </w:p>
     <w:p>
@@ -402,6 +402,11 @@
     </w:p>
     <w:p>
       <w:r>
+        <w:t>Por último, el sitio entrega los resultados: la imagen con los contornos marcados, una tabla, la gráfica de distribución, el archivo CSV y el informe en PDF.</w:t>
+      </w:r>
+    </w:p>
+    <w:p>
+      <w:r>
         <w:t>Fíjense que hay una parte que aprende y otra que calcula. La que aprende es la red, y por eso necesita ejemplos y entrenamiento. La que calcula es el código, y por eso es preciso, repetible y fácil de comprobar.</w:t>
       </w:r>
     </w:p>
@@ -474,7 +479,7 @@
     </w:p>
     <w:p>
       <w:r>
-        <w:t>En la diapositiva tengo, a la izquierda, una imagen pequeña con un cuadro azul marcado. A la derecha, lo que hay dentro de ese cuadro, ampliado hasta que se ven los números. Son treinta y cinco cuadritos, siete por cinco. Fíjense en la parte de afuera: números bajos, casi negros. Y en el centro, números altos, hasta un doscientos cincuenta y cinco. Eso es lo que la computadora tiene delante cuando mira una imagen.</w:t>
+        <w:t>En la diapositiva tengo, a la izquierda, una imagen pequeña con un cuadro azul marcado. A la derecha, lo que hay dentro de ese cuadro, ampliado hasta que se ven los números. Son treinta y cinco cuadritos, siete por cinco. Fíjense en la parte de afuera: números bajos, oscuros. Y en el centro, números altos, hasta un doscientos cincuenta y cinco. Eso es lo que la computadora tiene delante cuando mira una imagen.</w:t>
       </w:r>
     </w:p>
     <w:p>
@@ -638,7 +643,7 @@
           <w:i/>
           <w:sz w:val="20"/>
         </w:rPr>
-        <w:t>Idea central: Un histograma cuenta cuántos píxeles hay de cada nivel de brillo. En fluorescencia, casi todos son oscuros y unos pocos son muy brillantes, y esa forma explica por qué un umbral parece funcionar.</w:t>
+        <w:t>Idea central: Un histograma cuenta cuántos píxeles hay de cada nivel de brillo. En fluorescencia, casi todos son oscuros y unos pocos son muy brillantes, y sirve para comprobar si una imagen está bien expuesta.</w:t>
       </w:r>
     </w:p>
     <w:p>
@@ -776,7 +781,7 @@
     </w:p>
     <w:p>
       <w:r>
-        <w:t>Veámoslo con números. Si sesenta píxeles son una micra, un largo de sesenta píxeles es una micra de largo, y un largo de trescientos píxeles son cinco micras, que es justo la regla que va dibujada en la imagen. Con las áreas hay un paso más. Un área se mide en unidades cuadradas, así que una micra cuadrada son sesenta por sesenta píxeles, es decir, tres mil seiscientos píxeles. Si una célula ocupa tres mil seiscientos píxeles, su área es de una micra cuadrada. Si ocupa la mitad, media micra cuadrada. Por eso, en el sitio, las áreas en micras cuadradas pueden salir como números pequeños.</w:t>
+        <w:t>Veámoslo con números. Si sesenta píxeles son una micra, un largo de sesenta píxeles es una micra de largo, y un largo de trescientos píxeles son cinco micras, que es justo la regla que va dibujada en la imagen. Con las áreas hay un paso más. Un área se mide en unidades cuadradas, así que una micra cuadrada son sesenta por sesenta píxeles, es decir, tres mil seiscientos píxeles. Si una célula ocupa tres mil seiscientos píxeles, su área es de una micra cuadrada. Si ocupa la mitad, media micra cuadrada. Y si ocupa siete mil doscientos píxeles, el doble, son dos micras cuadradas. Por eso, en el sitio, las áreas en micras cuadradas pueden salir como números pequeños.</w:t>
       </w:r>
     </w:p>
     <w:p>

</xml_diff>